<commit_message>
fixed website link in resume
</commit_message>
<xml_diff>
--- a/resume.docx
+++ b/resume.docx
@@ -93,7 +93,7 @@
         </w:rPr>
         <w:t xml:space="preserve">  </w:t>
       </w:r>
-      <w:hyperlink r:id="R0a4945049035476a">
+      <w:hyperlink r:id="Ra9d1e2508b2a45ca">
         <w:r>
           <w:rPr>
             <w:rStyle w:val="Hyperlink"/>
@@ -133,7 +133,7 @@
         </w:rPr>
         <w:t xml:space="preserve">|  </w:t>
       </w:r>
-      <w:hyperlink r:id="Ra1092e5906f34bbb">
+      <w:hyperlink r:id="R497de41a778a4354">
         <w:r>
           <w:rPr>
             <w:rStyle w:val="Hyperlink"/>

</xml_diff>